<commit_message>
Deploying to gh-pages from @ Morrison-Lab/qbt@e027bc43d37773f196b597958cba358b8ba93f2b 🚀
</commit_message>
<xml_diff>
--- a/Your-Book-Title.docx
+++ b/Your-Book-Title.docx
@@ -23,7 +23,7 @@
         <w:pStyle w:val="Date"/>
       </w:pPr>
       <w:r>
-        <w:t xml:space="preserve">Last updated: 2026-07-31</w:t>
+        <w:t xml:space="preserve">Last updated: 2026-09-14</w:t>
       </w:r>
     </w:p>
     <w:bookmarkStart w:id="15" w:name="welcome"/>
@@ -2265,7 +2265,7 @@
         <w:t xml:space="preserve"> </w:t>
       </w:r>
       <w:r>
-        <w:t xml:space="preserve">5e32aca</w:t>
+        <w:t xml:space="preserve">e027bc4</w:t>
       </w:r>
     </w:p>
     <w:p>
@@ -2287,7 +2287,7 @@
         <w:t xml:space="preserve"> </w:t>
       </w:r>
       <w:r>
-        <w:t xml:space="preserve">5e32aca1d48c891e3e17b882c10dda1f7eae0f0a</w:t>
+        <w:t xml:space="preserve">e027bc43d37773f196b597958cba358b8ba93f2b</w:t>
       </w:r>
     </w:p>
     <w:p>
@@ -2309,7 +2309,7 @@
         <w:t xml:space="preserve"> </w:t>
       </w:r>
       <w:r>
-        <w:t xml:space="preserve">2026-07-31 10:00:37 -0700</w:t>
+        <w:t xml:space="preserve">2026-09-14 15:25:31 -0700</w:t>
       </w:r>
     </w:p>
     <w:p>

</xml_diff>

<commit_message>
Deploying to gh-pages from @ Morrison-Lab/qbt@51df89ef97ae5613027282736601ac4594e3b7e7 🚀
</commit_message>
<xml_diff>
--- a/Your-Book-Title.docx
+++ b/Your-Book-Title.docx
@@ -2265,7 +2265,7 @@
         <w:t xml:space="preserve"> </w:t>
       </w:r>
       <w:r>
-        <w:t xml:space="preserve">e027bc4</w:t>
+        <w:t xml:space="preserve">51df89e</w:t>
       </w:r>
     </w:p>
     <w:p>
@@ -2287,7 +2287,7 @@
         <w:t xml:space="preserve"> </w:t>
       </w:r>
       <w:r>
-        <w:t xml:space="preserve">e027bc43d37773f196b597958cba358b8ba93f2b</w:t>
+        <w:t xml:space="preserve">51df89ef97ae5613027282736601ac4594e3b7e7</w:t>
       </w:r>
     </w:p>
     <w:p>
@@ -2309,7 +2309,7 @@
         <w:t xml:space="preserve"> </w:t>
       </w:r>
       <w:r>
-        <w:t xml:space="preserve">2026-09-14 15:25:31 -0700</w:t>
+        <w:t xml:space="preserve">2026-09-14 15:46:39 -0700</w:t>
       </w:r>
     </w:p>
     <w:p>

</xml_diff>

<commit_message>
Deploying to gh-pages from @ Morrison-Lab/qbt@aeaf186353e2cb5de5fee6903af89fa11109f648 🚀
</commit_message>
<xml_diff>
--- a/Your-Book-Title.docx
+++ b/Your-Book-Title.docx
@@ -2265,7 +2265,7 @@
         <w:t xml:space="preserve"> </w:t>
       </w:r>
       <w:r>
-        <w:t xml:space="preserve">51df89e</w:t>
+        <w:t xml:space="preserve">aeaf186</w:t>
       </w:r>
     </w:p>
     <w:p>
@@ -2287,7 +2287,7 @@
         <w:t xml:space="preserve"> </w:t>
       </w:r>
       <w:r>
-        <w:t xml:space="preserve">51df89ef97ae5613027282736601ac4594e3b7e7</w:t>
+        <w:t xml:space="preserve">aeaf186353e2cb5de5fee6903af89fa11109f648</w:t>
       </w:r>
     </w:p>
     <w:p>
@@ -2309,7 +2309,7 @@
         <w:t xml:space="preserve"> </w:t>
       </w:r>
       <w:r>
-        <w:t xml:space="preserve">2026-09-14 15:46:39 -0700</w:t>
+        <w:t xml:space="preserve">2026-09-14 15:53:56 -0700</w:t>
       </w:r>
     </w:p>
     <w:p>

</xml_diff>

<commit_message>
Deploying to gh-pages from @ Morrison-Lab/qbt@8e843fa53b7ef28d81691263d7b8113db137f8e8 🚀
</commit_message>
<xml_diff>
--- a/Your-Book-Title.docx
+++ b/Your-Book-Title.docx
@@ -23,7 +23,7 @@
         <w:pStyle w:val="Date"/>
       </w:pPr>
       <w:r>
-        <w:t xml:space="preserve">Last updated: 2026-09-14</w:t>
+        <w:t xml:space="preserve">Last updated: 2026-09-15</w:t>
       </w:r>
     </w:p>
     <w:bookmarkStart w:id="15" w:name="welcome"/>
@@ -2265,7 +2265,7 @@
         <w:t xml:space="preserve"> </w:t>
       </w:r>
       <w:r>
-        <w:t xml:space="preserve">aeaf186</w:t>
+        <w:t xml:space="preserve">8e843fa</w:t>
       </w:r>
     </w:p>
     <w:p>
@@ -2287,7 +2287,7 @@
         <w:t xml:space="preserve"> </w:t>
       </w:r>
       <w:r>
-        <w:t xml:space="preserve">aeaf186353e2cb5de5fee6903af89fa11109f648</w:t>
+        <w:t xml:space="preserve">8e843fa53b7ef28d81691263d7b8113db137f8e8</w:t>
       </w:r>
     </w:p>
     <w:p>
@@ -2309,7 +2309,7 @@
         <w:t xml:space="preserve"> </w:t>
       </w:r>
       <w:r>
-        <w:t xml:space="preserve">2026-09-14 15:53:56 -0700</w:t>
+        <w:t xml:space="preserve">2026-09-14 17:43:00 -0700</w:t>
       </w:r>
     </w:p>
     <w:p>

</xml_diff>

<commit_message>
Deploying to gh-pages from @ Morrison-Lab/qbt@2b325ff2e53e4bf305efb2ec4dfb9ce369bab6bb 🚀
</commit_message>
<xml_diff>
--- a/Your-Book-Title.docx
+++ b/Your-Book-Title.docx
@@ -2265,7 +2265,7 @@
         <w:t xml:space="preserve"> </w:t>
       </w:r>
       <w:r>
-        <w:t xml:space="preserve">8e843fa</w:t>
+        <w:t xml:space="preserve">2b325ff</w:t>
       </w:r>
     </w:p>
     <w:p>
@@ -2287,7 +2287,7 @@
         <w:t xml:space="preserve"> </w:t>
       </w:r>
       <w:r>
-        <w:t xml:space="preserve">8e843fa53b7ef28d81691263d7b8113db137f8e8</w:t>
+        <w:t xml:space="preserve">2b325ff2e53e4bf305efb2ec4dfb9ce369bab6bb</w:t>
       </w:r>
     </w:p>
     <w:p>
@@ -2309,7 +2309,7 @@
         <w:t xml:space="preserve"> </w:t>
       </w:r>
       <w:r>
-        <w:t xml:space="preserve">2026-09-14 17:43:00 -0700</w:t>
+        <w:t xml:space="preserve">2026-09-14 19:12:07 -0700</w:t>
       </w:r>
     </w:p>
     <w:p>

</xml_diff>

<commit_message>
Deploying to gh-pages from @ Morrison-Lab/qbt@94e0c6530b9dd1e371111a9e13a202ef61dfabbd 🚀
</commit_message>
<xml_diff>
--- a/Your-Book-Title.docx
+++ b/Your-Book-Title.docx
@@ -2265,7 +2265,7 @@
         <w:t xml:space="preserve"> </w:t>
       </w:r>
       <w:r>
-        <w:t xml:space="preserve">2b325ff</w:t>
+        <w:t xml:space="preserve">94e0c65</w:t>
       </w:r>
     </w:p>
     <w:p>
@@ -2287,7 +2287,7 @@
         <w:t xml:space="preserve"> </w:t>
       </w:r>
       <w:r>
-        <w:t xml:space="preserve">2b325ff2e53e4bf305efb2ec4dfb9ce369bab6bb</w:t>
+        <w:t xml:space="preserve">94e0c6530b9dd1e371111a9e13a202ef61dfabbd</w:t>
       </w:r>
     </w:p>
     <w:p>
@@ -2309,7 +2309,7 @@
         <w:t xml:space="preserve"> </w:t>
       </w:r>
       <w:r>
-        <w:t xml:space="preserve">2026-09-14 19:12:07 -0700</w:t>
+        <w:t xml:space="preserve">2026-09-14 19:17:55 -0700</w:t>
       </w:r>
     </w:p>
     <w:p>

</xml_diff>

<commit_message>
Deploying to gh-pages from @ Morrison-Lab/qbt@112cd832c0575dd93c424427af15e88bc5f2d449 🚀
</commit_message>
<xml_diff>
--- a/Your-Book-Title.docx
+++ b/Your-Book-Title.docx
@@ -2265,7 +2265,7 @@
         <w:t xml:space="preserve"> </w:t>
       </w:r>
       <w:r>
-        <w:t xml:space="preserve">94e0c65</w:t>
+        <w:t xml:space="preserve">112cd83</w:t>
       </w:r>
     </w:p>
     <w:p>
@@ -2287,7 +2287,7 @@
         <w:t xml:space="preserve"> </w:t>
       </w:r>
       <w:r>
-        <w:t xml:space="preserve">94e0c6530b9dd1e371111a9e13a202ef61dfabbd</w:t>
+        <w:t xml:space="preserve">112cd832c0575dd93c424427af15e88bc5f2d449</w:t>
       </w:r>
     </w:p>
     <w:p>
@@ -2309,7 +2309,7 @@
         <w:t xml:space="preserve"> </w:t>
       </w:r>
       <w:r>
-        <w:t xml:space="preserve">2026-09-14 19:17:55 -0700</w:t>
+        <w:t xml:space="preserve">2026-09-14 19:23:12 -0700</w:t>
       </w:r>
     </w:p>
     <w:p>

</xml_diff>

<commit_message>
Deploying to gh-pages from @ Morrison-Lab/qbt@bae26194916b53d63f403202cbd9388d8e3e2736 🚀
</commit_message>
<xml_diff>
--- a/Your-Book-Title.docx
+++ b/Your-Book-Title.docx
@@ -2265,7 +2265,7 @@
         <w:t xml:space="preserve"> </w:t>
       </w:r>
       <w:r>
-        <w:t xml:space="preserve">112cd83</w:t>
+        <w:t xml:space="preserve">bae2619</w:t>
       </w:r>
     </w:p>
     <w:p>
@@ -2287,7 +2287,7 @@
         <w:t xml:space="preserve"> </w:t>
       </w:r>
       <w:r>
-        <w:t xml:space="preserve">112cd832c0575dd93c424427af15e88bc5f2d449</w:t>
+        <w:t xml:space="preserve">bae26194916b53d63f403202cbd9388d8e3e2736</w:t>
       </w:r>
     </w:p>
     <w:p>
@@ -2309,7 +2309,7 @@
         <w:t xml:space="preserve"> </w:t>
       </w:r>
       <w:r>
-        <w:t xml:space="preserve">2026-09-14 19:23:12 -0700</w:t>
+        <w:t xml:space="preserve">2026-09-14 19:27:10 -0700</w:t>
       </w:r>
     </w:p>
     <w:p>

</xml_diff>

<commit_message>
Deploying to gh-pages from @ Morrison-Lab/qbt@cebaee1600b2fb515875c8dbbe4e9b957e3105e0 🚀
</commit_message>
<xml_diff>
--- a/Your-Book-Title.docx
+++ b/Your-Book-Title.docx
@@ -2265,7 +2265,7 @@
         <w:t xml:space="preserve"> </w:t>
       </w:r>
       <w:r>
-        <w:t xml:space="preserve">bae2619</w:t>
+        <w:t xml:space="preserve">cebaee1</w:t>
       </w:r>
     </w:p>
     <w:p>
@@ -2287,7 +2287,7 @@
         <w:t xml:space="preserve"> </w:t>
       </w:r>
       <w:r>
-        <w:t xml:space="preserve">bae26194916b53d63f403202cbd9388d8e3e2736</w:t>
+        <w:t xml:space="preserve">cebaee1600b2fb515875c8dbbe4e9b957e3105e0</w:t>
       </w:r>
     </w:p>
     <w:p>
@@ -2309,7 +2309,7 @@
         <w:t xml:space="preserve"> </w:t>
       </w:r>
       <w:r>
-        <w:t xml:space="preserve">2026-09-14 19:27:10 -0700</w:t>
+        <w:t xml:space="preserve">2026-09-14 21:04:45 -0700</w:t>
       </w:r>
     </w:p>
     <w:p>

</xml_diff>

<commit_message>
Deploying to gh-pages from @ Morrison-Lab/qbt@53a3c86d032bf325dcc7fa8ce2fd31fa27f40edb 🚀
</commit_message>
<xml_diff>
--- a/Your-Book-Title.docx
+++ b/Your-Book-Title.docx
@@ -2265,7 +2265,7 @@
         <w:t xml:space="preserve"> </w:t>
       </w:r>
       <w:r>
-        <w:t xml:space="preserve">cebaee1</w:t>
+        <w:t xml:space="preserve">53a3c86</w:t>
       </w:r>
     </w:p>
     <w:p>
@@ -2287,7 +2287,7 @@
         <w:t xml:space="preserve"> </w:t>
       </w:r>
       <w:r>
-        <w:t xml:space="preserve">cebaee1600b2fb515875c8dbbe4e9b957e3105e0</w:t>
+        <w:t xml:space="preserve">53a3c86d032bf325dcc7fa8ce2fd31fa27f40edb</w:t>
       </w:r>
     </w:p>
     <w:p>
@@ -2309,7 +2309,7 @@
         <w:t xml:space="preserve"> </w:t>
       </w:r>
       <w:r>
-        <w:t xml:space="preserve">2026-09-14 21:04:45 -0700</w:t>
+        <w:t xml:space="preserve">2026-09-14 21:04:58 -0700</w:t>
       </w:r>
     </w:p>
     <w:p>

</xml_diff>

<commit_message>
Deploying to gh-pages from @ Morrison-Lab/qbt@8de5eaad8a757e3e149c59c6cc2ac38a0b0d8e11 🚀
</commit_message>
<xml_diff>
--- a/Your-Book-Title.docx
+++ b/Your-Book-Title.docx
@@ -2265,7 +2265,7 @@
         <w:t xml:space="preserve"> </w:t>
       </w:r>
       <w:r>
-        <w:t xml:space="preserve">53a3c86</w:t>
+        <w:t xml:space="preserve">8de5eaa</w:t>
       </w:r>
     </w:p>
     <w:p>
@@ -2287,7 +2287,7 @@
         <w:t xml:space="preserve"> </w:t>
       </w:r>
       <w:r>
-        <w:t xml:space="preserve">53a3c86d032bf325dcc7fa8ce2fd31fa27f40edb</w:t>
+        <w:t xml:space="preserve">8de5eaad8a757e3e149c59c6cc2ac38a0b0d8e11</w:t>
       </w:r>
     </w:p>
     <w:p>
@@ -2309,7 +2309,7 @@
         <w:t xml:space="preserve"> </w:t>
       </w:r>
       <w:r>
-        <w:t xml:space="preserve">2026-09-14 21:04:58 -0700</w:t>
+        <w:t xml:space="preserve">2026-09-14 23:59:37 -0700</w:t>
       </w:r>
     </w:p>
     <w:p>

</xml_diff>

<commit_message>
Deploying to gh-pages from @ Morrison-Lab/qbt@bd379de9db52b34d719e75705734b1c115a2f3aa 🚀
</commit_message>
<xml_diff>
--- a/Your-Book-Title.docx
+++ b/Your-Book-Title.docx
@@ -2265,7 +2265,7 @@
         <w:t xml:space="preserve"> </w:t>
       </w:r>
       <w:r>
-        <w:t xml:space="preserve">8de5eaa</w:t>
+        <w:t xml:space="preserve">bd379de</w:t>
       </w:r>
     </w:p>
     <w:p>
@@ -2287,7 +2287,7 @@
         <w:t xml:space="preserve"> </w:t>
       </w:r>
       <w:r>
-        <w:t xml:space="preserve">8de5eaad8a757e3e149c59c6cc2ac38a0b0d8e11</w:t>
+        <w:t xml:space="preserve">bd379de9db52b34d719e75705734b1c115a2f3aa</w:t>
       </w:r>
     </w:p>
     <w:p>
@@ -2309,7 +2309,7 @@
         <w:t xml:space="preserve"> </w:t>
       </w:r>
       <w:r>
-        <w:t xml:space="preserve">2026-09-14 23:59:37 -0700</w:t>
+        <w:t xml:space="preserve">2026-09-15 10:52:10 -0700</w:t>
       </w:r>
     </w:p>
     <w:p>

</xml_diff>

<commit_message>
Deploying to gh-pages from @ Morrison-Lab/qbt@37ec89d6dfe1cbc7bd39b7896a2f6df67a1e1055 🚀
</commit_message>
<xml_diff>
--- a/Your-Book-Title.docx
+++ b/Your-Book-Title.docx
@@ -2265,7 +2265,7 @@
         <w:t xml:space="preserve"> </w:t>
       </w:r>
       <w:r>
-        <w:t xml:space="preserve">bd379de</w:t>
+        <w:t xml:space="preserve">37ec89d</w:t>
       </w:r>
     </w:p>
     <w:p>
@@ -2287,7 +2287,7 @@
         <w:t xml:space="preserve"> </w:t>
       </w:r>
       <w:r>
-        <w:t xml:space="preserve">bd379de9db52b34d719e75705734b1c115a2f3aa</w:t>
+        <w:t xml:space="preserve">37ec89d6dfe1cbc7bd39b7896a2f6df67a1e1055</w:t>
       </w:r>
     </w:p>
     <w:p>
@@ -2309,7 +2309,7 @@
         <w:t xml:space="preserve"> </w:t>
       </w:r>
       <w:r>
-        <w:t xml:space="preserve">2026-09-15 10:52:10 -0700</w:t>
+        <w:t xml:space="preserve">2026-09-15 11:00:14 -0700</w:t>
       </w:r>
     </w:p>
     <w:p>

</xml_diff>

<commit_message>
Deploying to gh-pages from @ Morrison-Lab/qbt@b1dc3bee2d90a63b37cf0896cdae0dde75599c8f 🚀
</commit_message>
<xml_diff>
--- a/Your-Book-Title.docx
+++ b/Your-Book-Title.docx
@@ -23,7 +23,7 @@
         <w:pStyle w:val="Date"/>
       </w:pPr>
       <w:r>
-        <w:t xml:space="preserve">Last updated: 2026-09-29</w:t>
+        <w:t xml:space="preserve">Last updated: 2026-10-08</w:t>
       </w:r>
     </w:p>
     <w:bookmarkStart w:id="15" w:name="welcome"/>
@@ -2265,7 +2265,7 @@
         <w:t xml:space="preserve"> </w:t>
       </w:r>
       <w:r>
-        <w:t xml:space="preserve">c56c629</w:t>
+        <w:t xml:space="preserve">b1dc3be</w:t>
       </w:r>
     </w:p>
     <w:p>
@@ -2287,7 +2287,7 @@
         <w:t xml:space="preserve"> </w:t>
       </w:r>
       <w:r>
-        <w:t xml:space="preserve">c56c6299d0b6bb8aeec38d0d3f8420a0dfb22be2</w:t>
+        <w:t xml:space="preserve">b1dc3bee2d90a63b37cf0896cdae0dde75599c8f</w:t>
       </w:r>
     </w:p>
     <w:p>
@@ -2309,7 +2309,7 @@
         <w:t xml:space="preserve"> </w:t>
       </w:r>
       <w:r>
-        <w:t xml:space="preserve">2026-09-29 00:08:49 -0700</w:t>
+        <w:t xml:space="preserve">2026-10-08 14:55:47 -0700</w:t>
       </w:r>
     </w:p>
     <w:p>

</xml_diff>

<commit_message>
Deploying to gh-pages from @ Morrison-Lab/qbt@1bfdc4df69693b55bd053c0ebdb853f0428c918c 🚀
</commit_message>
<xml_diff>
--- a/Your-Book-Title.docx
+++ b/Your-Book-Title.docx
@@ -23,7 +23,7 @@
         <w:pStyle w:val="Date"/>
       </w:pPr>
       <w:r>
-        <w:t xml:space="preserve">Last updated: 2026-10-08</w:t>
+        <w:t xml:space="preserve">Last updated: 2026-10-09</w:t>
       </w:r>
     </w:p>
     <w:bookmarkStart w:id="15" w:name="welcome"/>
@@ -2265,7 +2265,7 @@
         <w:t xml:space="preserve"> </w:t>
       </w:r>
       <w:r>
-        <w:t xml:space="preserve">b1dc3be</w:t>
+        <w:t xml:space="preserve">1bfdc4d</w:t>
       </w:r>
     </w:p>
     <w:p>
@@ -2287,7 +2287,7 @@
         <w:t xml:space="preserve"> </w:t>
       </w:r>
       <w:r>
-        <w:t xml:space="preserve">b1dc3bee2d90a63b37cf0896cdae0dde75599c8f</w:t>
+        <w:t xml:space="preserve">1bfdc4df69693b55bd053c0ebdb853f0428c918c</w:t>
       </w:r>
     </w:p>
     <w:p>
@@ -2309,7 +2309,7 @@
         <w:t xml:space="preserve"> </w:t>
       </w:r>
       <w:r>
-        <w:t xml:space="preserve">2026-10-08 14:55:47 -0700</w:t>
+        <w:t xml:space="preserve">2026-10-09 01:31:59 +0000</w:t>
       </w:r>
     </w:p>
     <w:p>

</xml_diff>

<commit_message>
Deploying to gh-pages from @ Morrison-Lab/qbt@dc1519f27c73fc70bab6c2caa375dccc51f4c669 🚀
</commit_message>
<xml_diff>
--- a/Your-Book-Title.docx
+++ b/Your-Book-Title.docx
@@ -23,7 +23,7 @@
         <w:pStyle w:val="Date"/>
       </w:pPr>
       <w:r>
-        <w:t xml:space="preserve">Last updated: 2026-10-09</w:t>
+        <w:t xml:space="preserve">Last updated: 2026-10-19</w:t>
       </w:r>
     </w:p>
     <w:bookmarkStart w:id="15" w:name="welcome"/>
@@ -2265,7 +2265,7 @@
         <w:t xml:space="preserve"> </w:t>
       </w:r>
       <w:r>
-        <w:t xml:space="preserve">1bfdc4d</w:t>
+        <w:t xml:space="preserve">dc1519f</w:t>
       </w:r>
     </w:p>
     <w:p>
@@ -2287,7 +2287,7 @@
         <w:t xml:space="preserve"> </w:t>
       </w:r>
       <w:r>
-        <w:t xml:space="preserve">1bfdc4df69693b55bd053c0ebdb853f0428c918c</w:t>
+        <w:t xml:space="preserve">dc1519f27c73fc70bab6c2caa375dccc51f4c669</w:t>
       </w:r>
     </w:p>
     <w:p>
@@ -2309,7 +2309,7 @@
         <w:t xml:space="preserve"> </w:t>
       </w:r>
       <w:r>
-        <w:t xml:space="preserve">2026-10-09 01:31:59 +0000</w:t>
+        <w:t xml:space="preserve">2026-10-19 09:55:48 -0700</w:t>
       </w:r>
     </w:p>
     <w:p>

</xml_diff>

<commit_message>
Deploying to gh-pages from @ Morrison-Lab/qbt@eea540428a276a57037a3bda5a217b0261b95f1c 🚀
</commit_message>
<xml_diff>
--- a/Your-Book-Title.docx
+++ b/Your-Book-Title.docx
@@ -23,7 +23,7 @@
         <w:pStyle w:val="Date"/>
       </w:pPr>
       <w:r>
-        <w:t xml:space="preserve">Last updated: 2026-10-19</w:t>
+        <w:t xml:space="preserve">Last updated: 2026-10-23</w:t>
       </w:r>
     </w:p>
     <w:bookmarkStart w:id="15" w:name="welcome"/>
@@ -2265,7 +2265,7 @@
         <w:t xml:space="preserve"> </w:t>
       </w:r>
       <w:r>
-        <w:t xml:space="preserve">dc1519f</w:t>
+        <w:t xml:space="preserve">eea5404</w:t>
       </w:r>
     </w:p>
     <w:p>
@@ -2287,7 +2287,7 @@
         <w:t xml:space="preserve"> </w:t>
       </w:r>
       <w:r>
-        <w:t xml:space="preserve">dc1519f27c73fc70bab6c2caa375dccc51f4c669</w:t>
+        <w:t xml:space="preserve">eea540428a276a57037a3bda5a217b0261b95f1c</w:t>
       </w:r>
     </w:p>
     <w:p>
@@ -2309,7 +2309,7 @@
         <w:t xml:space="preserve"> </w:t>
       </w:r>
       <w:r>
-        <w:t xml:space="preserve">2026-10-19 09:55:48 -0700</w:t>
+        <w:t xml:space="preserve">2026-10-22 21:44:44 -0700</w:t>
       </w:r>
     </w:p>
     <w:p>

</xml_diff>

<commit_message>
Deploying to gh-pages from @ Morrison-Lab/qbt@fb31edaac8f6187e8c1955128072a5b01f99708b 🚀
</commit_message>
<xml_diff>
--- a/Your-Book-Title.docx
+++ b/Your-Book-Title.docx
@@ -2265,7 +2265,7 @@
         <w:t xml:space="preserve"> </w:t>
       </w:r>
       <w:r>
-        <w:t xml:space="preserve">eea5404</w:t>
+        <w:t xml:space="preserve">fb31eda</w:t>
       </w:r>
     </w:p>
     <w:p>
@@ -2287,7 +2287,7 @@
         <w:t xml:space="preserve"> </w:t>
       </w:r>
       <w:r>
-        <w:t xml:space="preserve">eea540428a276a57037a3bda5a217b0261b95f1c</w:t>
+        <w:t xml:space="preserve">fb31edaac8f6187e8c1955128072a5b01f99708b</w:t>
       </w:r>
     </w:p>
     <w:p>
@@ -2309,7 +2309,7 @@
         <w:t xml:space="preserve"> </w:t>
       </w:r>
       <w:r>
-        <w:t xml:space="preserve">2026-10-22 21:44:44 -0700</w:t>
+        <w:t xml:space="preserve">2026-10-23 01:13:43 -0700</w:t>
       </w:r>
     </w:p>
     <w:p>

</xml_diff>

<commit_message>
Deploying to gh-pages from @ Morrison-Lab/qbt@a58cf57266f5f33c1d477a2218164928870338b9 🚀
</commit_message>
<xml_diff>
--- a/Your-Book-Title.docx
+++ b/Your-Book-Title.docx
@@ -2265,7 +2265,7 @@
         <w:t xml:space="preserve"> </w:t>
       </w:r>
       <w:r>
-        <w:t xml:space="preserve">fb31eda</w:t>
+        <w:t xml:space="preserve">a58cf57</w:t>
       </w:r>
     </w:p>
     <w:p>
@@ -2287,7 +2287,7 @@
         <w:t xml:space="preserve"> </w:t>
       </w:r>
       <w:r>
-        <w:t xml:space="preserve">fb31edaac8f6187e8c1955128072a5b01f99708b</w:t>
+        <w:t xml:space="preserve">a58cf57266f5f33c1d477a2218164928870338b9</w:t>
       </w:r>
     </w:p>
     <w:p>
@@ -2309,7 +2309,7 @@
         <w:t xml:space="preserve"> </w:t>
       </w:r>
       <w:r>
-        <w:t xml:space="preserve">2026-10-23 01:13:43 -0700</w:t>
+        <w:t xml:space="preserve">2026-10-23 01:59:19 -0700</w:t>
       </w:r>
     </w:p>
     <w:p>

</xml_diff>

<commit_message>
Deploying to gh-pages from @ Morrison-Lab/qbt@3acf7b98bfb5fa07ed9118efc9a8497425dda6f9 🚀
</commit_message>
<xml_diff>
--- a/Your-Book-Title.docx
+++ b/Your-Book-Title.docx
@@ -23,7 +23,7 @@
         <w:pStyle w:val="Date"/>
       </w:pPr>
       <w:r>
-        <w:t xml:space="preserve">Last updated: 2026-10-23</w:t>
+        <w:t xml:space="preserve">Last updated: 2026-10-26</w:t>
       </w:r>
     </w:p>
     <w:bookmarkStart w:id="15" w:name="welcome"/>
@@ -2265,7 +2265,7 @@
         <w:t xml:space="preserve"> </w:t>
       </w:r>
       <w:r>
-        <w:t xml:space="preserve">a58cf57</w:t>
+        <w:t xml:space="preserve">3acf7b9</w:t>
       </w:r>
     </w:p>
     <w:p>
@@ -2287,7 +2287,7 @@
         <w:t xml:space="preserve"> </w:t>
       </w:r>
       <w:r>
-        <w:t xml:space="preserve">a58cf57266f5f33c1d477a2218164928870338b9</w:t>
+        <w:t xml:space="preserve">3acf7b98bfb5fa07ed9118efc9a8497425dda6f9</w:t>
       </w:r>
     </w:p>
     <w:p>
@@ -2309,7 +2309,7 @@
         <w:t xml:space="preserve"> </w:t>
       </w:r>
       <w:r>
-        <w:t xml:space="preserve">2026-10-23 01:59:19 -0700</w:t>
+        <w:t xml:space="preserve">2026-10-26 02:58:56 -0700</w:t>
       </w:r>
     </w:p>
     <w:p>

</xml_diff>

<commit_message>
Deploying to gh-pages from @ Morrison-Lab/qbt@9b0a886adbed36198c5b1e8ba216548425b22b87 🚀
</commit_message>
<xml_diff>
--- a/Your-Book-Title.docx
+++ b/Your-Book-Title.docx
@@ -23,7 +23,7 @@
         <w:pStyle w:val="Date"/>
       </w:pPr>
       <w:r>
-        <w:t xml:space="preserve">Last updated: 2026-10-26</w:t>
+        <w:t xml:space="preserve">Last updated: 2026-10-27</w:t>
       </w:r>
     </w:p>
     <w:bookmarkStart w:id="15" w:name="welcome"/>
@@ -2265,7 +2265,7 @@
         <w:t xml:space="preserve"> </w:t>
       </w:r>
       <w:r>
-        <w:t xml:space="preserve">3acf7b9</w:t>
+        <w:t xml:space="preserve">9b0a886</w:t>
       </w:r>
     </w:p>
     <w:p>
@@ -2287,7 +2287,7 @@
         <w:t xml:space="preserve"> </w:t>
       </w:r>
       <w:r>
-        <w:t xml:space="preserve">3acf7b98bfb5fa07ed9118efc9a8497425dda6f9</w:t>
+        <w:t xml:space="preserve">9b0a886adbed36198c5b1e8ba216548425b22b87</w:t>
       </w:r>
     </w:p>
     <w:p>
@@ -2309,7 +2309,7 @@
         <w:t xml:space="preserve"> </w:t>
       </w:r>
       <w:r>
-        <w:t xml:space="preserve">2026-10-26 02:58:56 -0700</w:t>
+        <w:t xml:space="preserve">2026-10-26 23:10:56 -0700</w:t>
       </w:r>
     </w:p>
     <w:p>

</xml_diff>